<commit_message>
Agregado de ejercicios de posesivos y pronombres
</commit_message>
<xml_diff>
--- a/01-plan-y-registro/word/01-plan-de-estudio.docx
+++ b/01-plan-y-registro/word/01-plan-de-estudio.docx
@@ -2,7 +2,7 @@
 <file path=word/document.xml><?xml version="1.0" encoding="utf-8"?>
 <w:document xmlns:w="http://schemas.openxmlformats.org/wordprocessingml/2006/main" xmlns:m="http://schemas.openxmlformats.org/officeDocument/2006/math" xmlns:r="http://schemas.openxmlformats.org/officeDocument/2006/relationships" xmlns:o="urn:schemas-microsoft-com:office:office" xmlns:v="urn:schemas-microsoft-com:vml" xmlns:w10="urn:schemas-microsoft-com:office:word" xmlns:a="http://schemas.openxmlformats.org/drawingml/2006/main" xmlns:pic="http://schemas.openxmlformats.org/drawingml/2006/picture" xmlns:wp="http://schemas.openxmlformats.org/drawingml/2006/wordprocessingDrawing">
   <w:body>
-    <w:bookmarkStart w:id="42" w:name="Xc55f359e3ec33a4cf11b8afc96b69cf1025a18e"/>
+    <w:bookmarkStart w:id="43" w:name="Xc55f359e3ec33a4cf11b8afc96b69cf1025a18e"/>
     <w:p>
       <w:pPr>
         <w:pStyle w:val="Heading1"/>
@@ -27,7 +27,7 @@
         <w:t xml:space="preserve">Este es el punto de partida: el orden de los materiales, una rutina semanal y un plan por meses para llegar a las entrevistas hablando con soltura.</w:t>
       </w:r>
     </w:p>
-    <w:bookmarkStart w:id="38" w:name="materiales-en-el-orden-para-trabajarlos"/>
+    <w:bookmarkStart w:id="39" w:name="materiales-en-el-orden-para-trabajarlos"/>
     <w:p>
       <w:pPr>
         <w:pStyle w:val="Heading2"/>
@@ -891,9 +891,64 @@
           </w:p>
         </w:tc>
       </w:tr>
+      <w:tr>
+        <w:tc>
+          <w:tcPr/>
+          <w:p>
+            <w:pPr>
+              <w:pStyle w:val="Compact"/>
+              <w:jc w:val="left"/>
+            </w:pPr>
+            <w:r>
+              <w:t xml:space="preserve">14</w:t>
+            </w:r>
+          </w:p>
+        </w:tc>
+        <w:tc>
+          <w:tcPr/>
+          <w:p>
+            <w:pPr>
+              <w:pStyle w:val="Compact"/>
+              <w:jc w:val="left"/>
+            </w:pPr>
+            <w:hyperlink r:id="rId38">
+              <w:r>
+                <w:rPr>
+                  <w:rStyle w:val="Hyperlink"/>
+                </w:rPr>
+                <w:t xml:space="preserve">Posesivos y pronombres</w:t>
+              </w:r>
+            </w:hyperlink>
+          </w:p>
+        </w:tc>
+        <w:tc>
+          <w:tcPr/>
+          <w:p>
+            <w:pPr>
+              <w:pStyle w:val="Compact"/>
+              <w:jc w:val="left"/>
+            </w:pPr>
+            <w:r>
+              <w:t xml:space="preserve">my / mine, its / it's, his / her / its, 's y sujeto obligatorio, desde tu tarea de los tres objetos. 6 bloques de ejercicios</w:t>
+            </w:r>
+          </w:p>
+        </w:tc>
+        <w:tc>
+          <w:tcPr/>
+          <w:p>
+            <w:pPr>
+              <w:pStyle w:val="Compact"/>
+              <w:jc w:val="left"/>
+            </w:pPr>
+            <w:r>
+              <w:t xml:space="preserve">Repaso urgente, lunes de gramática</w:t>
+            </w:r>
+          </w:p>
+        </w:tc>
+      </w:tr>
     </w:tbl>
-    <w:bookmarkEnd w:id="38"/>
-    <w:bookmarkStart w:id="39" w:name="rutina-semanal"/>
+    <w:bookmarkEnd w:id="39"/>
+    <w:bookmarkStart w:id="40" w:name="rutina-semanal"/>
     <w:p>
       <w:pPr>
         <w:pStyle w:val="Heading2"/>
@@ -1329,8 +1384,8 @@
         <w:t xml:space="preserve">anotá en el registro de errores los 3 errores que más se repitieron en la semana. Ese es el foco de la semana siguiente.</w:t>
       </w:r>
     </w:p>
-    <w:bookmarkEnd w:id="39"/>
-    <w:bookmarkStart w:id="40" w:name="plan-por-meses"/>
+    <w:bookmarkEnd w:id="40"/>
+    <w:bookmarkStart w:id="41" w:name="plan-por-meses"/>
     <w:p>
       <w:pPr>
         <w:pStyle w:val="Heading2"/>
@@ -1756,8 +1811,8 @@
         </w:tc>
       </w:tr>
     </w:tbl>
-    <w:bookmarkEnd w:id="40"/>
-    <w:bookmarkStart w:id="41" w:name="cómo-practicar-conmigo"/>
+    <w:bookmarkEnd w:id="41"/>
+    <w:bookmarkStart w:id="42" w:name="cómo-practicar-conmigo"/>
     <w:p>
       <w:pPr>
         <w:pStyle w:val="Heading2"/>
@@ -2105,8 +2160,8 @@
         <w:t xml:space="preserve">si practicás hablando, usá el dictado por voz del celular para mandarme la respuesta. Así practicás la pronunciación y yo veo exactamente lo que dijiste.</w:t>
       </w:r>
     </w:p>
-    <w:bookmarkEnd w:id="41"/>
     <w:bookmarkEnd w:id="42"/>
+    <w:bookmarkEnd w:id="43"/>
     <w:sectPr/>
   </w:body>
 </w:document>

</xml_diff>